<commit_message>
docs: adiciona pratica aula 07
</commit_message>
<xml_diff>
--- a/Outubro/Atividade_aula_06-07/Aula_07/Pratica_Aula_07.docx
+++ b/Outubro/Atividade_aula_06-07/Aula_07/Pratica_Aula_07.docx
@@ -323,15 +323,7 @@
           <w:color w:val="303030"/>
           <w:lang w:val="pt-BR"/>
         </w:rPr>
-        <w:t>Esta prática foi</w:t>
-      </w:r>
-      <w:r>
-        <w:rPr>
-          <w:rFonts w:eastAsia="Arial" w:cs="Arial"/>
-          <w:color w:val="303030"/>
-          <w:lang w:val="pt-BR"/>
-        </w:rPr>
-        <w:t xml:space="preserve"> proposta para você transformar regras escritas em um Diagrama Entidade-Relacionamento (DER), como o técnico faz antes de criar as tabelas de um banco. Ao final, espera-se que você construa um DER com entidades, atributos, relacionamentos e </w:t>
+        <w:t xml:space="preserve">Esta prática foi proposta para você transformar regras escritas em um Diagrama Entidade-Relacionamento (DER), como o técnico faz antes de criar as tabelas de um banco. Ao final, espera-se que você construa um DER com entidades, atributos, relacionamentos e </w:t>
       </w:r>
       <w:proofErr w:type="spellStart"/>
       <w:r>
@@ -349,15 +341,7 @@
           <w:color w:val="303030"/>
           <w:lang w:val="pt-BR"/>
         </w:rPr>
-        <w:t xml:space="preserve"> </w:t>
-      </w:r>
-      <w:r>
-        <w:rPr>
-          <w:rFonts w:eastAsia="Arial" w:cs="Arial"/>
-          <w:color w:val="303030"/>
-          <w:lang w:val="pt-BR"/>
-        </w:rPr>
-        <w:t>corretas e que justifique cada cardinalidade a partir das regras.</w:t>
+        <w:t xml:space="preserve"> corretas e que justifique cada cardinalidade a partir das regras.</w:t>
       </w:r>
     </w:p>
     <w:p>
@@ -475,15 +459,7 @@
           <w:color w:val="303030"/>
           <w:lang w:val="pt-BR"/>
         </w:rPr>
-        <w:t xml:space="preserve"> e justific</w:t>
-      </w:r>
-      <w:r>
-        <w:rPr>
-          <w:rFonts w:eastAsia="Arial" w:cs="Arial"/>
-          <w:color w:val="303030"/>
-          <w:lang w:val="pt-BR"/>
-        </w:rPr>
-        <w:t xml:space="preserve">ar as </w:t>
+        <w:t xml:space="preserve"> e justificar as </w:t>
       </w:r>
       <w:proofErr w:type="spellStart"/>
       <w:r>
@@ -579,15 +555,7 @@
           <w:color w:val="303030"/>
           <w:lang w:val="pt-BR"/>
         </w:rPr>
-        <w:t>, que você vai usar nas aulas de SQL. Ela guarda os dados de uma rede de locadoras de filmes. Antes de usar um banco, o técnico precisa entender o modelo</w:t>
-      </w:r>
-      <w:r>
-        <w:rPr>
-          <w:rFonts w:eastAsia="Arial" w:cs="Arial"/>
-          <w:color w:val="303030"/>
-          <w:lang w:val="pt-BR"/>
-        </w:rPr>
-        <w:t xml:space="preserve"> dele. A sua tarefa é desenhar o DER conceitual da parte de filmes a partir das regras abaixo, tiradas da documentação oficial.</w:t>
+        <w:t>, que você vai usar nas aulas de SQL. Ela guarda os dados de uma rede de locadoras de filmes. Antes de usar um banco, o técnico precisa entender o modelo dele. A sua tarefa é desenhar o DER conceitual da parte de filmes a partir das regras abaixo, tiradas da documentação oficial.</w:t>
       </w:r>
     </w:p>
     <w:tbl>
@@ -805,16 +773,7 @@
                 <w:sz w:val="22"/>
                 <w:lang w:val="pt-BR"/>
               </w:rPr>
-              <w:t xml:space="preserve">Cada ator tem um </w:t>
-            </w:r>
-            <w:r>
-              <w:rPr>
-                <w:rFonts w:eastAsia="Arial" w:cs="Arial"/>
-                <w:color w:val="303030"/>
-                <w:sz w:val="22"/>
-                <w:lang w:val="pt-BR"/>
-              </w:rPr>
-              <w:t>código, um nome e um sobrenome.</w:t>
+              <w:t>Cada ator tem um código, um nome e um sobrenome.</w:t>
             </w:r>
           </w:p>
         </w:tc>
@@ -1017,16 +976,7 @@
                 <w:sz w:val="22"/>
                 <w:lang w:val="pt-BR"/>
               </w:rPr>
-              <w:t>Um filme pode ter vários atores, e um</w:t>
-            </w:r>
-            <w:r>
-              <w:rPr>
-                <w:rFonts w:eastAsia="Arial" w:cs="Arial"/>
-                <w:color w:val="303030"/>
-                <w:sz w:val="22"/>
-                <w:lang w:val="pt-BR"/>
-              </w:rPr>
-              <w:t xml:space="preserve"> ator pode atuar em vários filmes. Na base, </w:t>
+              <w:t xml:space="preserve">Um filme pode ter vários atores, e um ator pode atuar em vários filmes. Na base, </w:t>
             </w:r>
             <w:proofErr w:type="gramStart"/>
             <w:r>
@@ -1112,15 +1062,7 @@
           <w:color w:val="303030"/>
           <w:lang w:val="pt-BR"/>
         </w:rPr>
-        <w:t>, desenhe as entidades, os atributos (com o identificador sublinhado), os relacionamentos com um verbo no losango</w:t>
-      </w:r>
-      <w:r>
-        <w:rPr>
-          <w:rFonts w:eastAsia="Arial" w:cs="Arial"/>
-          <w:color w:val="303030"/>
-          <w:lang w:val="pt-BR"/>
-        </w:rPr>
-        <w:t xml:space="preserve"> e a cardinalidade (mínima, máxima) ao lado de cada entidade, como no livro. Salve como pratica-</w:t>
+        <w:t>, desenhe as entidades, os atributos (com o identificador sublinhado), os relacionamentos com um verbo no losango e a cardinalidade (mínima, máxima) ao lado de cada entidade, como no livro. Salve como pratica-</w:t>
       </w:r>
       <w:proofErr w:type="gramStart"/>
       <w:r>
@@ -1183,16 +1125,7 @@
           <w:lang w:val="pt-BR"/>
         </w:rPr>
         <w:lastRenderedPageBreak/>
-        <w:t>Qua</w:t>
-      </w:r>
-      <w:r>
-        <w:rPr>
-          <w:rFonts w:eastAsia="Arial" w:cs="Arial"/>
-          <w:b/>
-          <w:color w:val="303030"/>
-          <w:lang w:val="pt-BR"/>
-        </w:rPr>
-        <w:t>dro</w:t>
+        <w:t>Quadro</w:t>
       </w:r>
       <w:r>
         <w:rPr>
@@ -1378,21 +1311,7 @@
               <w:rPr>
                 <w:lang w:val="pt-BR"/>
               </w:rPr>
-              <w:t>(</w:t>
-            </w:r>
-            <w:proofErr w:type="gramStart"/>
-            <w:r>
-              <w:rPr>
-                <w:lang w:val="pt-BR"/>
-              </w:rPr>
-              <w:t>1</w:t>
-            </w:r>
-            <w:proofErr w:type="gramEnd"/>
-            <w:r>
-              <w:rPr>
-                <w:lang w:val="pt-BR"/>
-              </w:rPr>
-              <w:t>,n), Um para muitos</w:t>
+              <w:t>Idioma traduz um filme, e o filme é traduzido por um idioma</w:t>
             </w:r>
           </w:p>
         </w:tc>
@@ -1497,27 +1416,7 @@
                 <w:sz w:val="22"/>
                 <w:lang w:val="pt-BR"/>
               </w:rPr>
-              <w:t xml:space="preserve"> (</w:t>
-            </w:r>
-            <w:proofErr w:type="gramStart"/>
-            <w:r>
-              <w:rPr>
-                <w:rFonts w:eastAsia="Arial" w:cs="Arial"/>
-                <w:color w:val="303030"/>
-                <w:sz w:val="22"/>
-                <w:lang w:val="pt-BR"/>
-              </w:rPr>
-              <w:t>1</w:t>
-            </w:r>
-            <w:proofErr w:type="gramEnd"/>
-            <w:r>
-              <w:rPr>
-                <w:rFonts w:eastAsia="Arial" w:cs="Arial"/>
-                <w:color w:val="303030"/>
-                <w:sz w:val="22"/>
-                <w:lang w:val="pt-BR"/>
-              </w:rPr>
-              <w:t>,n), Um para muitos</w:t>
+              <w:t>Ator atua em um filme, e o filme é atuado por um Ator.</w:t>
             </w:r>
           </w:p>
         </w:tc>
@@ -1537,7 +1436,6 @@
               <w:rPr>
                 <w:rFonts w:eastAsia="Arial" w:cs="Arial"/>
                 <w:color w:val="303030"/>
-                <w:sz w:val="22"/>
                 <w:lang w:val="pt-BR"/>
               </w:rPr>
             </w:pPr>
@@ -1577,6 +1475,9 @@
           <w:bottom w:val="single" w:sz="4" w:space="1" w:color="BFBFBF"/>
         </w:pBdr>
         <w:spacing w:before="280" w:after="120" w:line="240" w:lineRule="auto"/>
+        <w:rPr>
+          <w:lang w:val="pt-BR"/>
+        </w:rPr>
       </w:pPr>
       <w:r>
         <w:rPr>
@@ -1584,60 +1485,10 @@
           <w:b/>
           <w:color w:val="004A8D"/>
           <w:sz w:val="26"/>
+          <w:lang w:val="pt-BR"/>
         </w:rPr>
-        <w:t xml:space="preserve">Como </w:t>
+        <w:t>Como enviar a atividade</w:t>
       </w:r>
-      <w:proofErr w:type="spellStart"/>
-      <w:r>
-        <w:rPr>
-          <w:rFonts w:eastAsia="Arial" w:cs="Arial"/>
-          <w:b/>
-          <w:color w:val="004A8D"/>
-          <w:sz w:val="26"/>
-        </w:rPr>
-        <w:t>enviar</w:t>
-      </w:r>
-      <w:proofErr w:type="spellEnd"/>
-      <w:r>
-        <w:rPr>
-          <w:rFonts w:eastAsia="Arial" w:cs="Arial"/>
-          <w:b/>
-          <w:color w:val="004A8D"/>
-          <w:sz w:val="26"/>
-        </w:rPr>
-        <w:t xml:space="preserve"> </w:t>
-      </w:r>
-      <w:proofErr w:type="gramStart"/>
-      <w:r>
-        <w:rPr>
-          <w:rFonts w:eastAsia="Arial" w:cs="Arial"/>
-          <w:b/>
-          <w:color w:val="004A8D"/>
-          <w:sz w:val="26"/>
-        </w:rPr>
-        <w:t>a</w:t>
-      </w:r>
-      <w:proofErr w:type="gramEnd"/>
-      <w:r>
-        <w:rPr>
-          <w:rFonts w:eastAsia="Arial" w:cs="Arial"/>
-          <w:b/>
-          <w:color w:val="004A8D"/>
-          <w:sz w:val="26"/>
-        </w:rPr>
-        <w:t xml:space="preserve"> </w:t>
-      </w:r>
-      <w:proofErr w:type="spellStart"/>
-      <w:r>
-        <w:rPr>
-          <w:rFonts w:eastAsia="Arial" w:cs="Arial"/>
-          <w:b/>
-          <w:color w:val="004A8D"/>
-          <w:sz w:val="26"/>
-        </w:rPr>
-        <w:t>atividade</w:t>
-      </w:r>
-      <w:proofErr w:type="spellEnd"/>
     </w:p>
     <w:p>
       <w:pPr>
@@ -1674,15 +1525,7 @@
           <w:color w:val="303030"/>
           <w:lang w:val="pt-BR"/>
         </w:rPr>
-        <w:t xml:space="preserve">Depois de preencher o quadro, salve este documento com o nome </w:t>
-      </w:r>
-      <w:r>
-        <w:rPr>
-          <w:rFonts w:eastAsia="Arial" w:cs="Arial"/>
-          <w:color w:val="303030"/>
-          <w:lang w:val="pt-BR"/>
-        </w:rPr>
-        <w:t>pratica-</w:t>
+        <w:t>Depois de preencher o quadro, salve este documento com o nome pratica-</w:t>
       </w:r>
       <w:proofErr w:type="gramStart"/>
       <w:r>
@@ -1870,15 +1713,7 @@
           <w:color w:val="303030"/>
           <w:lang w:val="pt-BR"/>
         </w:rPr>
-        <w:t xml:space="preserve"> dentro da pasta Banco/prati</w:t>
-      </w:r>
-      <w:r>
-        <w:rPr>
-          <w:rFonts w:eastAsia="Arial" w:cs="Arial"/>
-          <w:color w:val="303030"/>
-          <w:lang w:val="pt-BR"/>
-        </w:rPr>
-        <w:t>ca-07.</w:t>
+        <w:t xml:space="preserve"> dentro da pasta Banco/pratica-07.</w:t>
       </w:r>
     </w:p>
     <w:p>
@@ -2115,15 +1950,7 @@
           <w:color w:val="303030"/>
           <w:lang w:val="pt-BR"/>
         </w:rPr>
-        <w:t xml:space="preserve">No Google Sala de </w:t>
-      </w:r>
-      <w:r>
-        <w:rPr>
-          <w:rFonts w:eastAsia="Arial" w:cs="Arial"/>
-          <w:color w:val="303030"/>
-          <w:lang w:val="pt-BR"/>
-        </w:rPr>
-        <w:t>Aula, abra a atividade da aula 07, clique em Adicionar ou criar, escolha Link, cole o link e clique em Entregar.</w:t>
+        <w:t>No Google Sala de Aula, abra a atividade da aula 07, clique em Adicionar ou criar, escolha Link, cole o link e clique em Entregar.</w:t>
       </w:r>
     </w:p>
     <w:p>
@@ -2211,15 +2038,7 @@
           <w:color w:val="303030"/>
           <w:lang w:val="pt-BR"/>
         </w:rPr>
-        <w:t xml:space="preserve"> </w:t>
-      </w:r>
-      <w:r>
-        <w:rPr>
-          <w:rFonts w:eastAsia="Arial" w:cs="Arial"/>
-          <w:color w:val="303030"/>
-          <w:lang w:val="pt-BR"/>
-        </w:rPr>
-        <w:t>e pratica-07.</w:t>
+        <w:t xml:space="preserve"> e pratica-07.</w:t>
       </w:r>
       <w:proofErr w:type="spellStart"/>
       <w:r>
@@ -2351,15 +2170,7 @@
           <w:color w:val="303030"/>
           <w:lang w:val="pt-BR"/>
         </w:rPr>
-        <w:t>A cardinalidade (mínima, máxim</w:t>
-      </w:r>
-      <w:r>
-        <w:rPr>
-          <w:rFonts w:eastAsia="Arial" w:cs="Arial"/>
-          <w:color w:val="303030"/>
-          <w:lang w:val="pt-BR"/>
-        </w:rPr>
-        <w:t>a) está correta ao lado de cada entidade e o quadro de leitura justifica cada uma com a regra.</w:t>
+        <w:t>A cardinalidade (mínima, máxima) está correta ao lado de cada entidade e o quadro de leitura justifica cada uma com a regra.</w:t>
       </w:r>
     </w:p>
     <w:p>

</xml_diff>